<commit_message>
Match the executed agreement's typography and layout exactly
The generator now reproduces the executed Aminomega agreement as measured
from its PDF: Times New Roman 12 body, 12pt bold headings, 14pt bold centred
title, centred Effective Date line, recitals and schedule headings, 1-inch
margins, single spacing with 6pt paragraph gaps, typed list glyphs with
0.25-inch hanging indents stepping 0.5 inch per level, no page breaks, and
stacked left-aligned signature blocks with the client's Title left blank as
the executed form leaves it. Rendering Aminomega now matches the original
line for line at 8 pages, apart from nine wrap differences.

render() gains signnow_tags=False for a clean PDF with no hidden anchors,
for the manual-upload path where fields are placed in SignNow by hand.

Co-Authored-By: Claude Fable 5.1 <noreply@anthropic.com>
Claude-Session: https://claude.ai/code/session_016DmqTePGuqg43qEMw5GnhT
</commit_message>
<xml_diff>
--- a/templates/amazon_services_agreement.docx
+++ b/templates/amazon_services_agreement.docx
@@ -15,14 +15,11 @@
       </w:r>
     </w:p>
     <w:p>
+      <w:pPr>
+        <w:jc w:val="center"/>
+      </w:pPr>
       <w:r>
-        <w:rPr>
-          <w:b/>
-        </w:rPr>
-        <w:t xml:space="preserve">Effective Date: </w:t>
-      </w:r>
-      <w:r>
-        <w:t>{{ effective_date }}</w:t>
+        <w:t>Effective Date: {{ effective_date }}</w:t>
       </w:r>
     </w:p>
     <w:p>
@@ -33,11 +30,11 @@
     <w:p>
       <w:pPr>
         <w:spacing w:before="120"/>
+        <w:jc w:val="center"/>
       </w:pPr>
       <w:r>
         <w:rPr>
           <w:b/>
-          <w:sz w:val="24"/>
         </w:rPr>
         <w:t>RECITALS</w:t>
       </w:r>
@@ -69,14 +66,13 @@
       <w:r>
         <w:rPr>
           <w:b/>
-          <w:sz w:val="24"/>
         </w:rPr>
         <w:t>1. Scope of Services and Payment Terms</w:t>
       </w:r>
     </w:p>
     <w:p>
       <w:pPr>
-        <w:spacing w:before="60"/>
+        <w:spacing w:before="120"/>
       </w:pPr>
       <w:r>
         <w:rPr>
@@ -97,40 +93,60 @@
     </w:p>
     <w:p>
       <w:pPr>
-        <w:pStyle w:val="ListBullet"/>
+        <w:spacing w:after="80"/>
+        <w:ind w:left="720" w:hanging="360"/>
       </w:pPr>
+      <w:r>
+        <w:t xml:space="preserve">● </w:t>
+      </w:r>
       <w:r>
         <w:t>The Company will provide a list of its trademarks, logos, and copyrighted materials (Schedule C).</w:t>
       </w:r>
     </w:p>
     <w:p>
       <w:pPr>
-        <w:pStyle w:val="ListBullet"/>
+        <w:spacing w:after="80"/>
+        <w:ind w:left="720" w:hanging="360"/>
       </w:pPr>
+      <w:r>
+        <w:t xml:space="preserve">● </w:t>
+      </w:r>
       <w:r>
         <w:t>It will implement a Reseller Policy (Schedule E) and notify all resellers about it. The Company must keep proof of these notifications.</w:t>
       </w:r>
     </w:p>
     <w:p>
       <w:pPr>
-        <w:pStyle w:val="ListBullet"/>
+        <w:spacing w:after="80"/>
+        <w:ind w:left="720" w:hanging="360"/>
       </w:pPr>
+      <w:r>
+        <w:t xml:space="preserve">● </w:t>
+      </w:r>
       <w:r>
         <w:t>The Company will introduce a warranty for products sold by authorized resellers on these marketplaces.</w:t>
       </w:r>
     </w:p>
     <w:p>
       <w:pPr>
-        <w:pStyle w:val="ListBullet"/>
+        <w:spacing w:after="80"/>
+        <w:ind w:left="720" w:hanging="360"/>
       </w:pPr>
+      <w:r>
+        <w:t xml:space="preserve">● </w:t>
+      </w:r>
       <w:r>
         <w:t>It will establish a Minimum Advertised Price Policy.</w:t>
       </w:r>
     </w:p>
     <w:p>
       <w:pPr>
-        <w:pStyle w:val="ListBullet"/>
+        <w:spacing w:after="80"/>
+        <w:ind w:left="720" w:hanging="360"/>
       </w:pPr>
+      <w:r>
+        <w:t xml:space="preserve">● </w:t>
+      </w:r>
       <w:r>
         <w:t>The Company will maintain and update a list of authorized and unauthorized resellers (the “Reseller List”).</w:t>
       </w:r>
@@ -152,7 +168,7 @@
     </w:p>
     <w:p>
       <w:pPr>
-        <w:spacing w:before="60"/>
+        <w:spacing w:before="120"/>
       </w:pPr>
       <w:r>
         <w:rPr>
@@ -178,14 +194,13 @@
       <w:r>
         <w:rPr>
           <w:b/>
-          <w:sz w:val="24"/>
         </w:rPr>
         <w:t>2. Intellectual Property Rights</w:t>
       </w:r>
     </w:p>
     <w:p>
       <w:pPr>
-        <w:spacing w:before="60"/>
+        <w:spacing w:before="120"/>
       </w:pPr>
       <w:r>
         <w:rPr>
@@ -201,7 +216,7 @@
     </w:p>
     <w:p>
       <w:pPr>
-        <w:spacing w:before="60"/>
+        <w:spacing w:before="120"/>
       </w:pPr>
       <w:r>
         <w:rPr>
@@ -222,14 +237,13 @@
       <w:r>
         <w:rPr>
           <w:b/>
-          <w:sz w:val="24"/>
         </w:rPr>
         <w:t>3. Term and Termination</w:t>
       </w:r>
     </w:p>
     <w:p>
       <w:pPr>
-        <w:spacing w:before="60"/>
+        <w:spacing w:before="120"/>
       </w:pPr>
       <w:r>
         <w:rPr>
@@ -245,7 +259,7 @@
     </w:p>
     <w:p>
       <w:pPr>
-        <w:spacing w:before="60"/>
+        <w:spacing w:before="120"/>
       </w:pPr>
       <w:r>
         <w:rPr>
@@ -261,7 +275,7 @@
     </w:p>
     <w:p>
       <w:pPr>
-        <w:spacing w:before="60"/>
+        <w:spacing w:before="120"/>
       </w:pPr>
       <w:r>
         <w:rPr>
@@ -277,7 +291,7 @@
     </w:p>
     <w:p>
       <w:pPr>
-        <w:spacing w:before="60"/>
+        <w:spacing w:before="120"/>
       </w:pPr>
       <w:r>
         <w:rPr>
@@ -298,7 +312,6 @@
       <w:r>
         <w:rPr>
           <w:b/>
-          <w:sz w:val="24"/>
         </w:rPr>
         <w:t>4. Independent Contractor Relationship</w:t>
       </w:r>
@@ -315,14 +328,13 @@
       <w:r>
         <w:rPr>
           <w:b/>
-          <w:sz w:val="24"/>
         </w:rPr>
         <w:t>5. Confidentiality</w:t>
       </w:r>
     </w:p>
     <w:p>
       <w:pPr>
-        <w:spacing w:before="60"/>
+        <w:spacing w:before="120"/>
       </w:pPr>
       <w:r>
         <w:rPr>
@@ -338,7 +350,7 @@
     </w:p>
     <w:p>
       <w:pPr>
-        <w:spacing w:before="60"/>
+        <w:spacing w:before="120"/>
       </w:pPr>
       <w:r>
         <w:rPr>
@@ -354,7 +366,7 @@
     </w:p>
     <w:p>
       <w:pPr>
-        <w:spacing w:before="60"/>
+        <w:spacing w:before="120"/>
       </w:pPr>
       <w:r>
         <w:rPr>
@@ -375,14 +387,13 @@
       <w:r>
         <w:rPr>
           <w:b/>
-          <w:sz w:val="24"/>
         </w:rPr>
         <w:t>6. Indemnification and Limitation of Liability</w:t>
       </w:r>
     </w:p>
     <w:p>
       <w:pPr>
-        <w:spacing w:before="60"/>
+        <w:spacing w:before="120"/>
       </w:pPr>
       <w:r>
         <w:rPr>
@@ -398,7 +409,7 @@
     </w:p>
     <w:p>
       <w:pPr>
-        <w:spacing w:before="60"/>
+        <w:spacing w:before="120"/>
       </w:pPr>
       <w:r>
         <w:rPr>
@@ -419,14 +430,13 @@
       <w:r>
         <w:rPr>
           <w:b/>
-          <w:sz w:val="24"/>
         </w:rPr>
         <w:t>7. Dispute Resolution and Governing Law</w:t>
       </w:r>
     </w:p>
     <w:p>
       <w:pPr>
-        <w:spacing w:before="60"/>
+        <w:spacing w:before="120"/>
       </w:pPr>
       <w:r>
         <w:rPr>
@@ -442,7 +452,7 @@
     </w:p>
     <w:p>
       <w:pPr>
-        <w:spacing w:before="60"/>
+        <w:spacing w:before="120"/>
       </w:pPr>
       <w:r>
         <w:rPr>
@@ -463,14 +473,13 @@
       <w:r>
         <w:rPr>
           <w:b/>
-          <w:sz w:val="24"/>
         </w:rPr>
         <w:t>8. General Provisions</w:t>
       </w:r>
     </w:p>
     <w:p>
       <w:pPr>
-        <w:spacing w:before="60"/>
+        <w:spacing w:before="120"/>
       </w:pPr>
       <w:r>
         <w:rPr>
@@ -486,7 +495,7 @@
     </w:p>
     <w:p>
       <w:pPr>
-        <w:spacing w:before="60"/>
+        <w:spacing w:before="120"/>
       </w:pPr>
       <w:r>
         <w:rPr>
@@ -502,7 +511,7 @@
     </w:p>
     <w:p>
       <w:pPr>
-        <w:spacing w:before="60"/>
+        <w:spacing w:before="120"/>
       </w:pPr>
       <w:r>
         <w:rPr>
@@ -518,7 +527,7 @@
     </w:p>
     <w:p>
       <w:pPr>
-        <w:spacing w:before="60"/>
+        <w:spacing w:before="120"/>
       </w:pPr>
       <w:r>
         <w:rPr>
@@ -534,7 +543,7 @@
     </w:p>
     <w:p>
       <w:pPr>
-        <w:spacing w:before="60"/>
+        <w:spacing w:before="120"/>
       </w:pPr>
       <w:r>
         <w:rPr>
@@ -555,7 +564,6 @@
       <w:r>
         <w:rPr>
           <w:b/>
-          <w:sz w:val="24"/>
         </w:rPr>
         <w:t>9. Execution and Signature</w:t>
       </w:r>
@@ -565,132 +573,147 @@
         <w:t>The Parties acknowledge that they have read and understood this Agreement, and by signing below, agree to its terms.</w:t>
       </w:r>
     </w:p>
-    <w:tbl>
-      <w:tblPr>
-        <w:tblW w:type="auto" w:w="0"/>
-        <w:tblLook w:firstColumn="1" w:firstRow="1" w:lastColumn="0" w:lastRow="0" w:noHBand="0" w:noVBand="1" w:val="04A0"/>
-      </w:tblPr>
-      <w:tblGrid>
-        <w:gridCol w:w="4680"/>
-        <w:gridCol w:w="4680"/>
-      </w:tblGrid>
-      <w:tr>
-        <w:tc>
-          <w:tcPr>
-            <w:tcW w:type="dxa" w:w="4680"/>
-          </w:tcPr>
-          <w:p>
-            <w:r>
-              <w:rPr>
-                <w:b/>
-              </w:rPr>
-              <w:t>{{ company_legal_name }}</w:t>
-            </w:r>
-          </w:p>
-          <w:p>
-            <w:r>
-              <w:t xml:space="preserve">Signature: </w:t>
-            </w:r>
-            <w:r>
-              <w:rPr>
-                <w:color w:val="FFFFFF"/>
-              </w:rPr>
-              <w:t>{{ sn_client_signature }}</w:t>
-            </w:r>
-            <w:r>
-              <w:t>________________________</w:t>
-            </w:r>
-          </w:p>
-          <w:p>
-            <w:r>
-              <w:t xml:space="preserve">Name: </w:t>
-            </w:r>
-            <w:r>
-              <w:rPr>
-                <w:color w:val="FFFFFF"/>
-              </w:rPr>
-              <w:t>{{ sn_client_printed_name }}</w:t>
-            </w:r>
-            <w:r>
-              <w:t>____________</w:t>
-            </w:r>
-          </w:p>
-          <w:p>
-            <w:r>
-              <w:t>Title: {{ signatory_title }}</w:t>
-            </w:r>
-          </w:p>
-          <w:p>
-            <w:r>
-              <w:t xml:space="preserve">Date: </w:t>
-            </w:r>
-            <w:r>
-              <w:rPr>
-                <w:color w:val="FFFFFF"/>
-              </w:rPr>
-              <w:t>{{ sn_client_date }}</w:t>
-            </w:r>
-            <w:r>
-              <w:t>____________</w:t>
-            </w:r>
-          </w:p>
-        </w:tc>
-        <w:tc>
-          <w:tcPr>
-            <w:tcW w:type="dxa" w:w="4680"/>
-          </w:tcPr>
-          <w:p>
-            <w:r>
-              <w:rPr>
-                <w:b/>
-              </w:rPr>
-              <w:t>Chief Marketplace Officer, Inc.</w:t>
-            </w:r>
-          </w:p>
-          <w:p>
-            <w:r>
-              <w:t>Signature: ____ {{ cmo_signature_mark }} ____</w:t>
-            </w:r>
-          </w:p>
-          <w:p>
-            <w:r>
-              <w:t>Name: {{ cmo_signatory_name }}</w:t>
-            </w:r>
-          </w:p>
-          <w:p>
-            <w:r>
-              <w:t>Title: {{ cmo_signatory_title }}</w:t>
-            </w:r>
-          </w:p>
-          <w:p>
-            <w:r>
-              <w:t>Date: {{ cmo_signature_date }}</w:t>
-            </w:r>
-          </w:p>
-        </w:tc>
-      </w:tr>
-    </w:tbl>
     <w:p>
       <w:pPr>
-        <w:spacing w:before="120"/>
+        <w:spacing w:after="0"/>
+      </w:pPr>
+    </w:p>
+    <w:p>
+      <w:pPr>
+        <w:spacing w:after="80"/>
       </w:pPr>
       <w:r>
         <w:rPr>
           <w:b/>
-          <w:sz w:val="24"/>
+        </w:rPr>
+        <w:t>{{ company_legal_name }}</w:t>
+      </w:r>
+    </w:p>
+    <w:p>
+      <w:pPr>
+        <w:spacing w:after="80"/>
+      </w:pPr>
+      <w:r>
+        <w:t xml:space="preserve">Signature: </w:t>
+      </w:r>
+      <w:r>
+        <w:rPr>
+          <w:color w:val="FFFFFF"/>
+        </w:rPr>
+        <w:t>{{ sn_client_signature }}</w:t>
+      </w:r>
+      <w:r>
+        <w:t>________________________</w:t>
+      </w:r>
+    </w:p>
+    <w:p>
+      <w:pPr>
+        <w:spacing w:after="80"/>
+      </w:pPr>
+      <w:r>
+        <w:t xml:space="preserve">Name: </w:t>
+      </w:r>
+      <w:r>
+        <w:rPr>
+          <w:color w:val="FFFFFF"/>
+        </w:rPr>
+        <w:t>{{ sn_client_printed_name }}</w:t>
+      </w:r>
+      <w:r>
+        <w:t>{{ signatory_name }}____________</w:t>
+      </w:r>
+    </w:p>
+    <w:p>
+      <w:pPr>
+        <w:spacing w:after="80"/>
+      </w:pPr>
+      <w:r>
+        <w:t>Title: ____________________________</w:t>
+      </w:r>
+    </w:p>
+    <w:p>
+      <w:r>
+        <w:t xml:space="preserve">Date: </w:t>
+      </w:r>
+      <w:r>
+        <w:rPr>
+          <w:color w:val="FFFFFF"/>
+        </w:rPr>
+        <w:t>{{ sn_client_date }}</w:t>
+      </w:r>
+      <w:r>
+        <w:t>____________________________</w:t>
+      </w:r>
+    </w:p>
+    <w:p>
+      <w:pPr>
+        <w:spacing w:after="0"/>
+      </w:pPr>
+    </w:p>
+    <w:p>
+      <w:pPr>
+        <w:spacing w:after="80"/>
+      </w:pPr>
+      <w:r>
+        <w:rPr>
+          <w:b/>
+        </w:rPr>
+        <w:t>Chief Marketplace Officer, Inc.</w:t>
+      </w:r>
+    </w:p>
+    <w:p>
+      <w:pPr>
+        <w:spacing w:after="80"/>
+      </w:pPr>
+      <w:r>
+        <w:t>Signature: ____ {{ cmo_signature_mark }}____</w:t>
+      </w:r>
+    </w:p>
+    <w:p>
+      <w:pPr>
+        <w:spacing w:after="80"/>
+      </w:pPr>
+      <w:r>
+        <w:t>Name: {{ cmo_signatory_name }}</w:t>
+      </w:r>
+    </w:p>
+    <w:p>
+      <w:pPr>
+        <w:spacing w:after="80"/>
+      </w:pPr>
+      <w:r>
+        <w:t>Title: {{ cmo_signatory_title }}</w:t>
+      </w:r>
+    </w:p>
+    <w:p>
+      <w:r>
+        <w:t>Date: {{ cmo_signature_date }}</w:t>
+      </w:r>
+    </w:p>
+    <w:p>
+      <w:pPr>
+        <w:spacing w:before="120"/>
+        <w:jc w:val="center"/>
+      </w:pPr>
+      <w:r>
+        <w:rPr>
+          <w:b/>
         </w:rPr>
         <w:t>Schedule A – Designated Third Party Marketplaces</w:t>
       </w:r>
     </w:p>
     <w:p>
+      <w:pPr>
+        <w:jc w:val="center"/>
+      </w:pPr>
       <w:r>
         <w:t>Chief Marketplace Officer, Inc. agrees to provide Consulting Services for the following third party marketplaces:</w:t>
       </w:r>
     </w:p>
     <w:p>
       <w:pPr>
-        <w:spacing w:after="40"/>
-        <w:ind w:left="504"/>
+        <w:spacing w:after="80"/>
+        <w:ind w:left="720" w:hanging="360"/>
       </w:pPr>
       <w:r>
         <w:t xml:space="preserve">1. </w:t>
@@ -700,6 +723,10 @@
       </w:r>
     </w:p>
     <w:p>
+      <w:pPr>
+        <w:spacing w:after="80"/>
+        <w:ind w:left="720" w:hanging="360"/>
+      </w:pPr>
       <w:r>
         <w:t>Additional marketplaces may be included as agreed upon by both Parties through a written amendment to this Schedule.</w:t>
       </w:r>
@@ -707,11 +734,11 @@
     <w:p>
       <w:pPr>
         <w:spacing w:before="120"/>
+        <w:jc w:val="center"/>
       </w:pPr>
       <w:r>
         <w:rPr>
           <w:b/>
-          <w:sz w:val="24"/>
         </w:rPr>
         <w:t>Schedule B – Consulting Services</w:t>
       </w:r>
@@ -722,13 +749,7 @@
       </w:r>
     </w:p>
     <w:p>
-      <w:pPr>
-        <w:spacing w:before="60"/>
-      </w:pPr>
       <w:r>
-        <w:rPr>
-          <w:b/>
-        </w:rPr>
         <w:t>Deliverables:</w:t>
       </w:r>
     </w:p>
@@ -739,8 +760,8 @@
     </w:p>
     <w:p>
       <w:pPr>
-        <w:spacing w:after="40"/>
-        <w:ind w:left="504"/>
+        <w:spacing w:after="80"/>
+        <w:ind w:left="720" w:hanging="360"/>
       </w:pPr>
       <w:r>
         <w:t xml:space="preserve">{{ loop.index }}. </w:t>
@@ -757,11 +778,11 @@
     <w:p>
       <w:pPr>
         <w:spacing w:before="120"/>
+        <w:jc w:val="center"/>
       </w:pPr>
       <w:r>
         <w:rPr>
           <w:b/>
-          <w:sz w:val="24"/>
         </w:rPr>
         <w:t>Schedule C – Intellectual Property</w:t>
       </w:r>
@@ -773,8 +794,8 @@
     </w:p>
     <w:p>
       <w:pPr>
-        <w:spacing w:after="40"/>
-        <w:ind w:left="504"/>
+        <w:spacing w:after="80"/>
+        <w:ind w:left="720" w:hanging="360"/>
       </w:pPr>
       <w:r>
         <w:t xml:space="preserve">1. </w:t>
@@ -785,8 +806,8 @@
     </w:p>
     <w:p>
       <w:pPr>
-        <w:spacing w:after="40"/>
-        <w:ind w:left="1008"/>
+        <w:spacing w:after="80"/>
+        <w:ind w:left="1440" w:hanging="360"/>
       </w:pPr>
       <w:r>
         <w:t xml:space="preserve">○ </w:t>
@@ -797,8 +818,8 @@
     </w:p>
     <w:p>
       <w:pPr>
-        <w:spacing w:after="40"/>
-        <w:ind w:left="504"/>
+        <w:spacing w:after="80"/>
+        <w:ind w:left="720" w:hanging="360"/>
       </w:pPr>
       <w:r>
         <w:t xml:space="preserve">2. </w:t>
@@ -809,8 +830,8 @@
     </w:p>
     <w:p>
       <w:pPr>
-        <w:spacing w:after="40"/>
-        <w:ind w:left="1008"/>
+        <w:spacing w:after="80"/>
+        <w:ind w:left="1440" w:hanging="360"/>
       </w:pPr>
       <w:r>
         <w:t xml:space="preserve">○ </w:t>
@@ -821,8 +842,8 @@
     </w:p>
     <w:p>
       <w:pPr>
-        <w:spacing w:after="40"/>
-        <w:ind w:left="504"/>
+        <w:spacing w:after="80"/>
+        <w:ind w:left="720" w:hanging="360"/>
       </w:pPr>
       <w:r>
         <w:t xml:space="preserve">3. </w:t>
@@ -833,8 +854,8 @@
     </w:p>
     <w:p>
       <w:pPr>
-        <w:spacing w:after="40"/>
-        <w:ind w:left="1008"/>
+        <w:spacing w:after="80"/>
+        <w:ind w:left="1440" w:hanging="360"/>
       </w:pPr>
       <w:r>
         <w:t xml:space="preserve">○ </w:t>
@@ -845,8 +866,8 @@
     </w:p>
     <w:p>
       <w:pPr>
-        <w:spacing w:after="40"/>
-        <w:ind w:left="504"/>
+        <w:spacing w:after="80"/>
+        <w:ind w:left="720" w:hanging="360"/>
       </w:pPr>
       <w:r>
         <w:t xml:space="preserve">4. </w:t>
@@ -857,8 +878,8 @@
     </w:p>
     <w:p>
       <w:pPr>
-        <w:spacing w:after="40"/>
-        <w:ind w:left="1008"/>
+        <w:spacing w:after="80"/>
+        <w:ind w:left="1440" w:hanging="360"/>
       </w:pPr>
       <w:r>
         <w:t xml:space="preserve">○ </w:t>
@@ -869,8 +890,7 @@
     </w:p>
     <w:p>
       <w:pPr>
-        <w:spacing w:after="40"/>
-        <w:ind w:left="1008"/>
+        <w:jc w:val="center"/>
       </w:pPr>
       <w:r>
         <w:t>{{ trademark_exhibit }}</w:t>
@@ -879,19 +899,19 @@
     <w:p>
       <w:pPr>
         <w:spacing w:before="120"/>
+        <w:jc w:val="center"/>
       </w:pPr>
       <w:r>
         <w:rPr>
           <w:b/>
-          <w:sz w:val="24"/>
         </w:rPr>
         <w:t>Schedule D – Indemnification Details</w:t>
       </w:r>
     </w:p>
     <w:p>
       <w:pPr>
-        <w:spacing w:after="40"/>
-        <w:ind w:left="504"/>
+        <w:spacing w:after="80"/>
+        <w:ind w:left="720" w:hanging="360"/>
       </w:pPr>
       <w:r>
         <w:t xml:space="preserve">1. </w:t>
@@ -902,8 +922,8 @@
     </w:p>
     <w:p>
       <w:pPr>
-        <w:spacing w:after="40"/>
-        <w:ind w:left="1008"/>
+        <w:spacing w:after="80"/>
+        <w:ind w:left="1440" w:hanging="360"/>
       </w:pPr>
       <w:r>
         <w:t xml:space="preserve">○ </w:t>
@@ -914,8 +934,8 @@
     </w:p>
     <w:p>
       <w:pPr>
-        <w:spacing w:after="40"/>
-        <w:ind w:left="1512"/>
+        <w:spacing w:after="80"/>
+        <w:ind w:left="2160" w:hanging="360"/>
       </w:pPr>
       <w:r>
         <w:t xml:space="preserve">a. </w:t>
@@ -926,8 +946,8 @@
     </w:p>
     <w:p>
       <w:pPr>
-        <w:spacing w:after="40"/>
-        <w:ind w:left="1512"/>
+        <w:spacing w:after="80"/>
+        <w:ind w:left="2160" w:hanging="360"/>
       </w:pPr>
       <w:r>
         <w:t xml:space="preserve">b. </w:t>
@@ -938,8 +958,8 @@
     </w:p>
     <w:p>
       <w:pPr>
-        <w:spacing w:after="40"/>
-        <w:ind w:left="1512"/>
+        <w:spacing w:after="80"/>
+        <w:ind w:left="2160" w:hanging="360"/>
       </w:pPr>
       <w:r>
         <w:t xml:space="preserve">c. </w:t>
@@ -950,8 +970,8 @@
     </w:p>
     <w:p>
       <w:pPr>
-        <w:spacing w:after="40"/>
-        <w:ind w:left="504"/>
+        <w:spacing w:after="80"/>
+        <w:ind w:left="720" w:hanging="360"/>
       </w:pPr>
       <w:r>
         <w:t xml:space="preserve">2. </w:t>
@@ -962,8 +982,8 @@
     </w:p>
     <w:p>
       <w:pPr>
-        <w:spacing w:after="40"/>
-        <w:ind w:left="1008"/>
+        <w:spacing w:after="80"/>
+        <w:ind w:left="1440" w:hanging="360"/>
       </w:pPr>
       <w:r>
         <w:t xml:space="preserve">○ </w:t>
@@ -974,8 +994,8 @@
     </w:p>
     <w:p>
       <w:pPr>
-        <w:spacing w:after="40"/>
-        <w:ind w:left="1512"/>
+        <w:spacing w:after="80"/>
+        <w:ind w:left="2160" w:hanging="360"/>
       </w:pPr>
       <w:r>
         <w:t xml:space="preserve">a. </w:t>
@@ -986,8 +1006,8 @@
     </w:p>
     <w:p>
       <w:pPr>
-        <w:spacing w:after="40"/>
-        <w:ind w:left="1512"/>
+        <w:spacing w:after="80"/>
+        <w:ind w:left="2160" w:hanging="360"/>
       </w:pPr>
       <w:r>
         <w:t xml:space="preserve">b. </w:t>
@@ -998,8 +1018,8 @@
     </w:p>
     <w:p>
       <w:pPr>
-        <w:spacing w:after="40"/>
-        <w:ind w:left="504"/>
+        <w:spacing w:after="80"/>
+        <w:ind w:left="720" w:hanging="360"/>
       </w:pPr>
       <w:r>
         <w:t xml:space="preserve">3. </w:t>
@@ -1010,8 +1030,8 @@
     </w:p>
     <w:p>
       <w:pPr>
-        <w:spacing w:after="40"/>
-        <w:ind w:left="1008"/>
+        <w:spacing w:after="80"/>
+        <w:ind w:left="1440" w:hanging="360"/>
       </w:pPr>
       <w:r>
         <w:t xml:space="preserve">○ </w:t>
@@ -1021,25 +1041,21 @@
       </w:r>
     </w:p>
     <w:p>
-      <w:r>
-        <w:br w:type="page"/>
-      </w:r>
-    </w:p>
-    <w:p>
       <w:pPr>
         <w:spacing w:before="120"/>
+        <w:jc w:val="center"/>
       </w:pPr>
       <w:r>
         <w:rPr>
           <w:b/>
-          <w:sz w:val="24"/>
         </w:rPr>
         <w:t>Schedule E – Sample Reseller Policy</w:t>
       </w:r>
     </w:p>
     <w:p>
       <w:pPr>
-        <w:spacing w:before="60"/>
+        <w:spacing w:before="120"/>
+        <w:jc w:val="center"/>
       </w:pPr>
       <w:r>
         <w:rPr>
@@ -1055,7 +1071,7 @@
     </w:p>
     <w:p>
       <w:pPr>
-        <w:spacing w:before="60"/>
+        <w:spacing w:before="120"/>
       </w:pPr>
       <w:r>
         <w:rPr>
@@ -1071,8 +1087,8 @@
     </w:p>
     <w:p>
       <w:pPr>
-        <w:spacing w:after="40"/>
-        <w:ind w:left="504"/>
+        <w:spacing w:after="80"/>
+        <w:ind w:left="720" w:hanging="360"/>
       </w:pPr>
       <w:r>
         <w:t xml:space="preserve">1. </w:t>
@@ -1083,8 +1099,8 @@
     </w:p>
     <w:p>
       <w:pPr>
-        <w:spacing w:after="40"/>
-        <w:ind w:left="504"/>
+        <w:spacing w:after="80"/>
+        <w:ind w:left="720" w:hanging="360"/>
       </w:pPr>
       <w:r>
         <w:t xml:space="preserve">2. </w:t>
@@ -1095,8 +1111,8 @@
     </w:p>
     <w:p>
       <w:pPr>
-        <w:spacing w:after="40"/>
-        <w:ind w:left="504"/>
+        <w:spacing w:after="80"/>
+        <w:ind w:left="720" w:hanging="360"/>
       </w:pPr>
       <w:r>
         <w:t xml:space="preserve">3. </w:t>
@@ -1107,8 +1123,8 @@
     </w:p>
     <w:p>
       <w:pPr>
-        <w:spacing w:after="40"/>
-        <w:ind w:left="504"/>
+        <w:spacing w:after="80"/>
+        <w:ind w:left="720" w:hanging="360"/>
       </w:pPr>
       <w:r>
         <w:t xml:space="preserve">4. </w:t>
@@ -1119,8 +1135,8 @@
     </w:p>
     <w:p>
       <w:pPr>
-        <w:spacing w:after="40"/>
-        <w:ind w:left="1008"/>
+        <w:spacing w:after="80"/>
+        <w:ind w:left="1440" w:hanging="360"/>
       </w:pPr>
       <w:r>
         <w:t xml:space="preserve">i) </w:t>
@@ -1131,8 +1147,8 @@
     </w:p>
     <w:p>
       <w:pPr>
-        <w:spacing w:after="40"/>
-        <w:ind w:left="1008"/>
+        <w:spacing w:after="80"/>
+        <w:ind w:left="1440" w:hanging="360"/>
       </w:pPr>
       <w:r>
         <w:t xml:space="preserve">ii) </w:t>
@@ -1143,8 +1159,8 @@
     </w:p>
     <w:p>
       <w:pPr>
-        <w:spacing w:after="40"/>
-        <w:ind w:left="1008"/>
+        <w:spacing w:after="80"/>
+        <w:ind w:left="1440" w:hanging="360"/>
       </w:pPr>
       <w:r>
         <w:t xml:space="preserve">iii) </w:t>
@@ -1155,7 +1171,7 @@
     </w:p>
     <w:p>
       <w:pPr>
-        <w:spacing w:before="60"/>
+        <w:spacing w:before="120"/>
       </w:pPr>
       <w:r>
         <w:rPr>
@@ -1171,7 +1187,7 @@
     </w:p>
     <w:p>
       <w:pPr>
-        <w:spacing w:before="60"/>
+        <w:spacing w:before="120"/>
       </w:pPr>
       <w:r>
         <w:rPr>
@@ -1187,7 +1203,7 @@
     </w:p>
     <w:p>
       <w:pPr>
-        <w:spacing w:before="60"/>
+        <w:spacing w:before="120"/>
       </w:pPr>
       <w:r>
         <w:rPr>
@@ -1203,7 +1219,7 @@
     </w:p>
     <w:p>
       <w:pPr>
-        <w:spacing w:before="60"/>
+        <w:spacing w:before="120"/>
       </w:pPr>
       <w:r>
         <w:rPr>
@@ -1219,7 +1235,7 @@
     </w:p>
     <w:p>
       <w:pPr>
-        <w:spacing w:before="60"/>
+        <w:spacing w:before="120"/>
       </w:pPr>
       <w:r>
         <w:rPr>
@@ -1235,7 +1251,7 @@
     </w:p>
     <w:p>
       <w:pPr>
-        <w:spacing w:before="60"/>
+        <w:spacing w:before="120"/>
       </w:pPr>
       <w:r>
         <w:rPr>
@@ -1251,7 +1267,7 @@
     </w:p>
     <w:p>
       <w:pPr>
-        <w:spacing w:before="60"/>
+        <w:spacing w:before="120"/>
       </w:pPr>
       <w:r>
         <w:rPr>
@@ -1270,89 +1286,104 @@
         <w:t>By signing below, you acknowledge and accept the terms and conditions outlined in the INSERT BRAND Reseller Policy, including our right to discontinue business with any reseller who violates this policy. Additionally, international sales of INSERT BRAND products are prohibited. Approved resellers may only sell INSERT BRAND products to end customers in the United States and Canada.</w:t>
       </w:r>
     </w:p>
-    <w:tbl>
-      <w:tblPr>
-        <w:tblW w:type="auto" w:w="0"/>
-        <w:tblLook w:firstColumn="1" w:firstRow="1" w:lastColumn="0" w:lastRow="0" w:noHBand="0" w:noVBand="1" w:val="04A0"/>
-      </w:tblPr>
-      <w:tblGrid>
-        <w:gridCol w:w="4680"/>
-        <w:gridCol w:w="4680"/>
-      </w:tblGrid>
-      <w:tr>
-        <w:tc>
-          <w:tcPr>
-            <w:tcW w:type="dxa" w:w="4680"/>
-          </w:tcPr>
-          <w:p>
-            <w:r>
-              <w:rPr>
-                <w:b/>
-              </w:rPr>
-              <w:t>INSERT BRAND</w:t>
-            </w:r>
-          </w:p>
-          <w:p>
-            <w:r>
-              <w:t>Signature: _______________________</w:t>
-            </w:r>
-          </w:p>
-          <w:p>
-            <w:r>
-              <w:t>Name: __________________________</w:t>
-            </w:r>
-          </w:p>
-          <w:p>
-            <w:r>
-              <w:t>Title: ____________________________</w:t>
-            </w:r>
-          </w:p>
-          <w:p>
-            <w:r>
-              <w:t>Date: ___________________________</w:t>
-            </w:r>
-          </w:p>
-        </w:tc>
-        <w:tc>
-          <w:tcPr>
-            <w:tcW w:type="dxa" w:w="4680"/>
-          </w:tcPr>
-          <w:p>
-            <w:r>
-              <w:rPr>
-                <w:b/>
-              </w:rPr>
-              <w:t>Reseller Information</w:t>
-            </w:r>
-          </w:p>
-          <w:p>
-            <w:r>
-              <w:t>Company Name: _________________</w:t>
-            </w:r>
-          </w:p>
-          <w:p>
-            <w:r>
-              <w:t>Signature: _______________________</w:t>
-            </w:r>
-          </w:p>
-          <w:p>
-            <w:r>
-              <w:t>Name: __________________________</w:t>
-            </w:r>
-          </w:p>
-          <w:p>
-            <w:r>
-              <w:t>Title: ____________________________</w:t>
-            </w:r>
-          </w:p>
-          <w:p>
-            <w:r>
-              <w:t>Date: ___________________________</w:t>
-            </w:r>
-          </w:p>
-        </w:tc>
-      </w:tr>
-    </w:tbl>
+    <w:p>
+      <w:pPr>
+        <w:spacing w:after="0"/>
+      </w:pPr>
+    </w:p>
+    <w:p>
+      <w:pPr>
+        <w:spacing w:after="80"/>
+      </w:pPr>
+      <w:r>
+        <w:rPr>
+          <w:b/>
+        </w:rPr>
+        <w:t>INSERT BRAND</w:t>
+      </w:r>
+    </w:p>
+    <w:p>
+      <w:pPr>
+        <w:spacing w:after="80"/>
+      </w:pPr>
+      <w:r>
+        <w:t>Signature: _______________________</w:t>
+      </w:r>
+    </w:p>
+    <w:p>
+      <w:pPr>
+        <w:spacing w:after="80"/>
+      </w:pPr>
+      <w:r>
+        <w:t>Name: __________________________</w:t>
+      </w:r>
+    </w:p>
+    <w:p>
+      <w:pPr>
+        <w:spacing w:after="80"/>
+      </w:pPr>
+      <w:r>
+        <w:t>Title: ____________________________</w:t>
+      </w:r>
+    </w:p>
+    <w:p>
+      <w:r>
+        <w:t>Date: ___________________________</w:t>
+      </w:r>
+    </w:p>
+    <w:p>
+      <w:pPr>
+        <w:spacing w:after="0"/>
+      </w:pPr>
+    </w:p>
+    <w:p>
+      <w:pPr>
+        <w:spacing w:after="80"/>
+      </w:pPr>
+      <w:r>
+        <w:rPr>
+          <w:b/>
+        </w:rPr>
+        <w:t>Reseller Information</w:t>
+      </w:r>
+    </w:p>
+    <w:p>
+      <w:pPr>
+        <w:spacing w:after="80"/>
+      </w:pPr>
+      <w:r>
+        <w:t>Company Name: _________________</w:t>
+      </w:r>
+    </w:p>
+    <w:p>
+      <w:pPr>
+        <w:spacing w:after="80"/>
+      </w:pPr>
+      <w:r>
+        <w:t>Signature: _______________________</w:t>
+      </w:r>
+    </w:p>
+    <w:p>
+      <w:pPr>
+        <w:spacing w:after="80"/>
+      </w:pPr>
+      <w:r>
+        <w:t>Name: __________________________</w:t>
+      </w:r>
+    </w:p>
+    <w:p>
+      <w:pPr>
+        <w:spacing w:after="80"/>
+      </w:pPr>
+      <w:r>
+        <w:t>Title: ____________________________</w:t>
+      </w:r>
+    </w:p>
+    <w:p>
+      <w:r>
+        <w:t>Date: ___________________________</w:t>
+      </w:r>
+    </w:p>
     <w:sectPr>
       <w:pgSz w:w="12240" w:h="15840"/>
       <w:pgMar w:top="1440" w:right="1440" w:bottom="1440" w:left="1440" w:header="720" w:footer="720" w:gutter="0"/>
@@ -1727,11 +1758,11 @@
     <w:qFormat/>
     <w:rsid w:val="00FC693F"/>
     <w:pPr>
-      <w:spacing w:after="80"/>
+      <w:spacing w:after="120" w:before="0" w:line="240" w:lineRule="auto"/>
     </w:pPr>
     <w:rPr>
-      <w:rFonts w:ascii="Calibri" w:hAnsi="Calibri"/>
-      <w:sz w:val="22"/>
+      <w:rFonts w:ascii="Times New Roman" w:hAnsi="Times New Roman" w:cs="Times New Roman" w:eastAsia="Times New Roman"/>
+      <w:sz w:val="24"/>
     </w:rPr>
   </w:style>
   <w:style w:type="paragraph" w:styleId="Header">
@@ -2262,10 +2293,6 @@
       </w:numPr>
       <w:contextualSpacing/>
     </w:pPr>
-    <w:rPr>
-      <w:rFonts w:ascii="Calibri" w:hAnsi="Calibri"/>
-      <w:sz w:val="22"/>
-    </w:rPr>
   </w:style>
   <w:style w:type="paragraph" w:styleId="ListBullet2">
     <w:name w:val="List Bullet 2"/>
@@ -2305,10 +2332,6 @@
       </w:numPr>
       <w:contextualSpacing/>
     </w:pPr>
-    <w:rPr>
-      <w:rFonts w:ascii="Calibri" w:hAnsi="Calibri"/>
-      <w:sz w:val="22"/>
-    </w:rPr>
   </w:style>
   <w:style w:type="paragraph" w:styleId="ListNumber2">
     <w:name w:val="List Number 2"/>

</xml_diff>

<commit_message>
Clarify Mitigate Stress commission from month one; italic W. Fikhman mark
The tiered fee sentence now ends "in each case plus a commission equal to
10%", with a following sentence stating the commission applies from the
first month in addition to whichever fee tier is in effect. CMO's typed
signature mark is "W. Fikhman" rendered in italics.

Co-Authored-By: Claude Fable 5.1 <noreply@anthropic.com>
Claude-Session: https://claude.ai/code/session_016DmqTePGuqg43qEMw5GnhT
</commit_message>
<xml_diff>
--- a/templates/amazon_services_agreement.docx
+++ b/templates/amazon_services_agreement.docx
@@ -666,7 +666,16 @@
         <w:spacing w:after="80"/>
       </w:pPr>
       <w:r>
-        <w:t>Signature: ____ {{ cmo_signature_mark }}____</w:t>
+        <w:t xml:space="preserve">Signature: ____ </w:t>
+      </w:r>
+      <w:r>
+        <w:rPr>
+          <w:i/>
+        </w:rPr>
+        <w:t>{{ cmo_signature_mark }}</w:t>
+      </w:r>
+      <w:r>
+        <w:t>____</w:t>
       </w:r>
     </w:p>
     <w:p>

</xml_diff>